<commit_message>
Resume: Cyber Security Analyst @ VBeyond Corporation (MNC)
</commit_message>
<xml_diff>
--- a/resumes/Resume_Cyber_Security_Analyst_VBeyond_Corporation__MNC_.docx
+++ b/resumes/Resume_Cyber_Security_Analyst_VBeyond_Corporation__MNC_.docx
@@ -413,7 +413,7 @@
           <w:sz w:val="19"/>
           <w:szCs w:val="19"/>
         </w:rPr>
-        <w:t>Triaged 50+ weekly inventory reimbursement cases by severity and policy eligibility, escalated findings to senior reviewers for incident response.</w:t>
+        <w:t>Triaged 50+ weekly inventory reimbursement cases by severity and policy eligibility, following structured workflows and decision-making processes.</w:t>
       </w:r>
     </w:p>
     <w:p>
@@ -432,7 +432,7 @@
           <w:sz w:val="19"/>
           <w:szCs w:val="19"/>
         </w:rPr>
-        <w:t>Analyzed seller claims, identified policy violations and anomalous patterns, and documented findings in audit-ready case documentation for root cause analysis.</w:t>
+        <w:t>Analyzed root cause of seller claims, identified policy violations and anomalous patterns, and escalated findings to senior reviewers for further action.</w:t>
       </w:r>
     </w:p>
     <w:p>
@@ -451,7 +451,7 @@
           <w:sz w:val="19"/>
           <w:szCs w:val="19"/>
         </w:rPr>
-        <w:t>Spotted recurring fraud patterns across 200+ weekly cases and flagged them early, reducing repeat-issue investigation time before escalation, and contributing to threat analysis.</w:t>
+        <w:t>Maintained audit-ready case documentation, recording investigation findings, decisions, evidence notes, and corrective actions for future reference.</w:t>
       </w:r>
     </w:p>
     <w:p>
@@ -470,7 +470,7 @@
           <w:sz w:val="19"/>
           <w:szCs w:val="19"/>
         </w:rPr>
-        <w:t>Maintained audit-ready case documentation recording investigation findings, decisions, evidence notes, and corrective actions for security analytics and network security.</w:t>
+        <w:t>Spotted recurring fraud patterns across 200+ weekly cases and flagged them early, reducing repeat-issue investigation time before escalation and improving overall risk management.</w:t>
       </w:r>
     </w:p>
     <w:p>
@@ -564,7 +564,7 @@
           <w:sz w:val="19"/>
           <w:szCs w:val="19"/>
         </w:rPr>
-        <w:t>Deployed Splunk SIEM with SPL searches for brute-force detection, lateral movement, and privilege escalation (T1110, T1078, T1059); mapped TTPs to MITRE ATT&amp;CK and wrote incident report.</w:t>
+        <w:t>Deployed Splunk SIEM with SPL searches for brute-force detection, lateral movement, and privilege escalation (T1110, T1078, T1059); mapped TTPs to MITRE ATT&amp;CK and wrote PICERL incident report with EPSS scoring.</w:t>
       </w:r>
     </w:p>
     <w:p>
@@ -583,7 +583,7 @@
           <w:sz w:val="19"/>
           <w:szCs w:val="19"/>
         </w:rPr>
-        <w:t>Built automated SOAR-style detection pipeline: ingests Splunk alerts, enriches with VirusTotal API, dispatches Telegram notifications with severity classification.</w:t>
+        <w:t>Developed SOAR-style detection pipeline: Python script ingests Splunk alerts, enriches with VirusTotal API, and dispatches Telegram notifications with severity classification.</w:t>
       </w:r>
     </w:p>
     <w:p>
@@ -672,7 +672,7 @@
           <w:sz w:val="19"/>
           <w:szCs w:val="19"/>
         </w:rPr>
-        <w:t>Developed automated vulnerability assessment pipeline integrating Nessus and OpenVAS REST APIs in Python, generating CVE reports with CVSS severity classification and EPSS scoring from FIRST.org API.</w:t>
+        <w:t>Developed automated vulnerability assessment pipeline integrating Nessus and OpenVAS APIs in Python, generating CVE reports with CVSS severity and EPSS scoring from FIRST.org API.</w:t>
       </w:r>
     </w:p>
     <w:p>
@@ -691,7 +691,7 @@
           <w:sz w:val="19"/>
           <w:szCs w:val="19"/>
         </w:rPr>
-        <w:t>Developed OWASP Top 10 automated web checker to detect injection, auth, and SSRF vulnerabilities via crafted HTTP requests.</w:t>
+        <w:t>Developed OWASP Top 10 automated web checker detecting injection, auth, and SSRF vulnerabilities via crafted HTTP requests.</w:t>
       </w:r>
     </w:p>
     <w:p>
@@ -710,7 +710,7 @@
           <w:sz w:val="19"/>
           <w:szCs w:val="19"/>
         </w:rPr>
-        <w:t>Automated scan scheduling via Bash and cron; built delta-scan logic for CVE flagging and remediation SLA deadlines (Critical=24hrs, High=7 days, Medium=30 days).</w:t>
+        <w:t>Automated scan scheduling via Bash and cron; built delta-scan logic to flag new CVEs and calculate remediation SLA deadlines (Critical=24hrs, High=7 days, Medium=30 days).</w:t>
       </w:r>
     </w:p>
     <w:p>
@@ -846,7 +846,7 @@
           <w:sz w:val="19"/>
           <w:szCs w:val="19"/>
         </w:rPr>
-        <w:t>Python, Bash (basic), regular expressions, incident response, endpoint security, cloud security</w:t>
+        <w:t>Python, Bash (basic), regular expressions, Compliance, Incident Response, Cloud Security</w:t>
       </w:r>
     </w:p>
     <w:p>

</xml_diff>